<commit_message>
Poursuite de la mise en place de l'éditeur
</commit_message>
<xml_diff>
--- a/backend/src/main/resources/templates/FicheDetailleeEquipement.docx
+++ b/backend/src/main/resources/templates/FicheDetailleeEquipement.docx
@@ -213,11 +213,7 @@
               </w:rPr>
             </w:pPr>
             <w:r>
-              <w:rPr>
-                <w:sz w:val="14"/>
-                <w:szCs w:val="14"/>
-                <w:lang w:val="zxx" w:eastAsia="zxx" w:bidi="zxx"/>
-              </w:rPr>
+              <w:rPr/>
               <w:drawing>
                 <wp:inline distT="0" distB="0" distL="0" distR="0">
                   <wp:extent cx="523875" cy="438150"/>
@@ -479,24 +475,6 @@
               </w:rPr>
               <w:t>Travail- Liberté – Patrie</w:t>
             </w:r>
-            <w:r>
-              <w:rPr>
-                <w:rFonts w:eastAsia="Iceland" w:cs="Iceland"/>
-                <w:sz w:val="14"/>
-                <w:szCs w:val="14"/>
-                <w:lang w:val="zxx" w:eastAsia="zxx" w:bidi="zxx"/>
-              </w:rPr>
-              <w:t xml:space="preserve"> </w:t>
-            </w:r>
-            <w:r>
-              <w:rPr>
-                <w:rFonts w:eastAsia="Iceland" w:cs="Iceland"/>
-                <w:sz w:val="16"/>
-                <w:szCs w:val="16"/>
-                <w:lang w:val="zxx" w:eastAsia="zxx" w:bidi="zxx"/>
-              </w:rPr>
-              <w:t xml:space="preserve">       </w:t>
-            </w:r>
           </w:p>
         </w:tc>
       </w:tr>
@@ -787,9 +765,9 @@
       </w:tblPr>
       <w:tblGrid>
         <w:gridCol w:w="2500"/>
-        <w:gridCol w:w="3000"/>
-        <w:gridCol w:w="2500"/>
-        <w:gridCol w:w="2595"/>
+        <w:gridCol w:w="2999"/>
+        <w:gridCol w:w="2501"/>
+        <w:gridCol w:w="2594"/>
       </w:tblGrid>
       <w:tr>
         <w:trPr/>
@@ -822,7 +800,7 @@
         </w:tc>
         <w:tc>
           <w:tcPr>
-            <w:tcW w:w="3000" w:type="dxa"/>
+            <w:tcW w:w="2999" w:type="dxa"/>
             <w:tcBorders>
               <w:bottom w:val="single" w:sz="4" w:space="0" w:color="CCCCCC"/>
             </w:tcBorders>
@@ -848,7 +826,7 @@
         </w:tc>
         <w:tc>
           <w:tcPr>
-            <w:tcW w:w="2500" w:type="dxa"/>
+            <w:tcW w:w="2501" w:type="dxa"/>
             <w:tcBorders>
               <w:bottom w:val="single" w:sz="4" w:space="0" w:color="CCCCCC"/>
             </w:tcBorders>
@@ -875,7 +853,7 @@
         </w:tc>
         <w:tc>
           <w:tcPr>
-            <w:tcW w:w="2595" w:type="dxa"/>
+            <w:tcW w:w="2594" w:type="dxa"/>
             <w:tcBorders>
               <w:bottom w:val="single" w:sz="4" w:space="0" w:color="CCCCCC"/>
             </w:tcBorders>
@@ -931,7 +909,7 @@
         </w:tc>
         <w:tc>
           <w:tcPr>
-            <w:tcW w:w="3000" w:type="dxa"/>
+            <w:tcW w:w="2999" w:type="dxa"/>
             <w:tcBorders>
               <w:bottom w:val="single" w:sz="4" w:space="0" w:color="CCCCCC"/>
             </w:tcBorders>
@@ -957,7 +935,7 @@
         </w:tc>
         <w:tc>
           <w:tcPr>
-            <w:tcW w:w="2500" w:type="dxa"/>
+            <w:tcW w:w="2501" w:type="dxa"/>
             <w:tcBorders>
               <w:bottom w:val="single" w:sz="4" w:space="0" w:color="CCCCCC"/>
             </w:tcBorders>
@@ -984,7 +962,7 @@
         </w:tc>
         <w:tc>
           <w:tcPr>
-            <w:tcW w:w="2595" w:type="dxa"/>
+            <w:tcW w:w="2594" w:type="dxa"/>
             <w:tcBorders>
               <w:bottom w:val="single" w:sz="4" w:space="0" w:color="CCCCCC"/>
             </w:tcBorders>
@@ -1040,7 +1018,7 @@
         </w:tc>
         <w:tc>
           <w:tcPr>
-            <w:tcW w:w="3000" w:type="dxa"/>
+            <w:tcW w:w="2999" w:type="dxa"/>
             <w:tcBorders>
               <w:bottom w:val="single" w:sz="4" w:space="0" w:color="CCCCCC"/>
             </w:tcBorders>
@@ -1066,7 +1044,7 @@
         </w:tc>
         <w:tc>
           <w:tcPr>
-            <w:tcW w:w="2500" w:type="dxa"/>
+            <w:tcW w:w="2501" w:type="dxa"/>
             <w:tcBorders>
               <w:bottom w:val="single" w:sz="4" w:space="0" w:color="CCCCCC"/>
             </w:tcBorders>
@@ -1093,7 +1071,7 @@
         </w:tc>
         <w:tc>
           <w:tcPr>
-            <w:tcW w:w="2595" w:type="dxa"/>
+            <w:tcW w:w="2594" w:type="dxa"/>
             <w:tcBorders>
               <w:bottom w:val="single" w:sz="4" w:space="0" w:color="CCCCCC"/>
             </w:tcBorders>
@@ -1149,7 +1127,7 @@
         </w:tc>
         <w:tc>
           <w:tcPr>
-            <w:tcW w:w="3000" w:type="dxa"/>
+            <w:tcW w:w="2999" w:type="dxa"/>
             <w:tcBorders>
               <w:bottom w:val="single" w:sz="4" w:space="0" w:color="CCCCCC"/>
             </w:tcBorders>
@@ -1175,7 +1153,7 @@
         </w:tc>
         <w:tc>
           <w:tcPr>
-            <w:tcW w:w="2500" w:type="dxa"/>
+            <w:tcW w:w="2501" w:type="dxa"/>
             <w:tcBorders>
               <w:bottom w:val="single" w:sz="4" w:space="0" w:color="CCCCCC"/>
             </w:tcBorders>
@@ -1202,7 +1180,7 @@
         </w:tc>
         <w:tc>
           <w:tcPr>
-            <w:tcW w:w="2595" w:type="dxa"/>
+            <w:tcW w:w="2594" w:type="dxa"/>
             <w:tcBorders>
               <w:bottom w:val="single" w:sz="4" w:space="0" w:color="CCCCCC"/>
             </w:tcBorders>
@@ -1258,7 +1236,7 @@
         </w:tc>
         <w:tc>
           <w:tcPr>
-            <w:tcW w:w="3000" w:type="dxa"/>
+            <w:tcW w:w="2999" w:type="dxa"/>
             <w:tcBorders>
               <w:bottom w:val="single" w:sz="4" w:space="0" w:color="CCCCCC"/>
             </w:tcBorders>
@@ -1284,7 +1262,7 @@
         </w:tc>
         <w:tc>
           <w:tcPr>
-            <w:tcW w:w="2500" w:type="dxa"/>
+            <w:tcW w:w="2501" w:type="dxa"/>
             <w:tcBorders>
               <w:bottom w:val="single" w:sz="4" w:space="0" w:color="CCCCCC"/>
             </w:tcBorders>
@@ -1311,7 +1289,7 @@
         </w:tc>
         <w:tc>
           <w:tcPr>
-            <w:tcW w:w="2595" w:type="dxa"/>
+            <w:tcW w:w="2594" w:type="dxa"/>
             <w:tcBorders>
               <w:bottom w:val="single" w:sz="4" w:space="0" w:color="CCCCCC"/>
             </w:tcBorders>
@@ -1367,7 +1345,7 @@
         </w:tc>
         <w:tc>
           <w:tcPr>
-            <w:tcW w:w="3000" w:type="dxa"/>
+            <w:tcW w:w="2999" w:type="dxa"/>
             <w:tcBorders>
               <w:bottom w:val="single" w:sz="4" w:space="0" w:color="CCCCCC"/>
             </w:tcBorders>
@@ -1393,7 +1371,7 @@
         </w:tc>
         <w:tc>
           <w:tcPr>
-            <w:tcW w:w="2500" w:type="dxa"/>
+            <w:tcW w:w="2501" w:type="dxa"/>
             <w:tcBorders>
               <w:bottom w:val="single" w:sz="4" w:space="0" w:color="CCCCCC"/>
             </w:tcBorders>
@@ -1420,7 +1398,7 @@
         </w:tc>
         <w:tc>
           <w:tcPr>
-            <w:tcW w:w="2595" w:type="dxa"/>
+            <w:tcW w:w="2594" w:type="dxa"/>
             <w:tcBorders>
               <w:bottom w:val="single" w:sz="4" w:space="0" w:color="CCCCCC"/>
             </w:tcBorders>
@@ -1476,7 +1454,7 @@
         </w:tc>
         <w:tc>
           <w:tcPr>
-            <w:tcW w:w="3000" w:type="dxa"/>
+            <w:tcW w:w="2999" w:type="dxa"/>
             <w:tcBorders>
               <w:bottom w:val="single" w:sz="4" w:space="0" w:color="CCCCCC"/>
             </w:tcBorders>
@@ -1502,7 +1480,7 @@
         </w:tc>
         <w:tc>
           <w:tcPr>
-            <w:tcW w:w="2500" w:type="dxa"/>
+            <w:tcW w:w="2501" w:type="dxa"/>
             <w:tcBorders>
               <w:bottom w:val="single" w:sz="4" w:space="0" w:color="CCCCCC"/>
             </w:tcBorders>
@@ -1529,7 +1507,7 @@
         </w:tc>
         <w:tc>
           <w:tcPr>
-            <w:tcW w:w="2595" w:type="dxa"/>
+            <w:tcW w:w="2594" w:type="dxa"/>
             <w:tcBorders>
               <w:bottom w:val="single" w:sz="4" w:space="0" w:color="CCCCCC"/>
             </w:tcBorders>
@@ -2472,7 +2450,13 @@
       </w:pPr>
       <w:r>
         <w:rPr>
-          <w:lang w:val="zxx" w:eastAsia="zxx" w:bidi="zxx"/>
+          <w:rFonts w:eastAsia="Iceland" w:cs="Iceland"/>
+          <w:b/>
+          <w:bCs/>
+          <w:i/>
+          <w:iCs/>
+          <w:sz w:val="20"/>
+          <w:szCs w:val="20"/>
         </w:rPr>
       </w:r>
       <w:r>
@@ -2524,7 +2508,13 @@
             </w:pPr>
             <w:r>
               <w:rPr>
-                <w:lang w:val="zxx" w:eastAsia="zxx" w:bidi="zxx"/>
+                <w:rFonts w:eastAsia="Iceland" w:cs="Iceland"/>
+                <w:b/>
+                <w:bCs/>
+                <w:i w:val="false"/>
+                <w:iCs w:val="false"/>
+                <w:sz w:val="16"/>
+                <w:szCs w:val="16"/>
               </w:rPr>
             </w:r>
           </w:p>
@@ -2546,7 +2536,9 @@
             </w:pPr>
             <w:r>
               <w:rPr>
-                <w:lang w:val="zxx" w:eastAsia="zxx" w:bidi="zxx"/>
+                <w:rFonts w:eastAsia="Iceland" w:cs="Iceland"/>
+                <w:sz w:val="16"/>
+                <w:szCs w:val="16"/>
               </w:rPr>
             </w:r>
           </w:p>
@@ -3331,8 +3323,8 @@
         </w:tblCellMar>
       </w:tblPr>
       <w:tblGrid>
-        <w:gridCol w:w="2199"/>
-        <w:gridCol w:w="4400"/>
+        <w:gridCol w:w="2198"/>
+        <w:gridCol w:w="4401"/>
         <w:gridCol w:w="2022"/>
         <w:gridCol w:w="2178"/>
       </w:tblGrid>
@@ -3342,7 +3334,7 @@
         </w:trPr>
         <w:tc>
           <w:tcPr>
-            <w:tcW w:w="2199" w:type="dxa"/>
+            <w:tcW w:w="2198" w:type="dxa"/>
             <w:tcBorders>
               <w:top w:val="single" w:sz="4" w:space="0" w:color="AAAAAA"/>
               <w:left w:val="single" w:sz="4" w:space="0" w:color="AAAAAA"/>
@@ -3373,7 +3365,7 @@
         </w:tc>
         <w:tc>
           <w:tcPr>
-            <w:tcW w:w="4400" w:type="dxa"/>
+            <w:tcW w:w="4401" w:type="dxa"/>
             <w:tcBorders>
               <w:top w:val="single" w:sz="4" w:space="0" w:color="AAAAAA"/>
               <w:left w:val="single" w:sz="4" w:space="0" w:color="DDDDDD"/>
@@ -3469,7 +3461,7 @@
         <w:trPr/>
         <w:tc>
           <w:tcPr>
-            <w:tcW w:w="2199" w:type="dxa"/>
+            <w:tcW w:w="2198" w:type="dxa"/>
             <w:tcBorders>
               <w:top w:val="single" w:sz="4" w:space="0" w:color="DDDDDD"/>
               <w:left w:val="single" w:sz="4" w:space="0" w:color="AAAAAA"/>
@@ -3498,7 +3490,7 @@
         </w:tc>
         <w:tc>
           <w:tcPr>
-            <w:tcW w:w="4400" w:type="dxa"/>
+            <w:tcW w:w="4401" w:type="dxa"/>
             <w:tcBorders>
               <w:top w:val="single" w:sz="4" w:space="0" w:color="DDDDDD"/>
               <w:left w:val="single" w:sz="4" w:space="0" w:color="DDDDDD"/>
@@ -3639,10 +3631,10 @@
         </w:tblCellMar>
       </w:tblPr>
       <w:tblGrid>
-        <w:gridCol w:w="2495"/>
-        <w:gridCol w:w="1705"/>
-        <w:gridCol w:w="2099"/>
-        <w:gridCol w:w="2101"/>
+        <w:gridCol w:w="2494"/>
+        <w:gridCol w:w="1706"/>
+        <w:gridCol w:w="2098"/>
+        <w:gridCol w:w="2102"/>
         <w:gridCol w:w="2400"/>
       </w:tblGrid>
       <w:tr>
@@ -3651,7 +3643,7 @@
         </w:trPr>
         <w:tc>
           <w:tcPr>
-            <w:tcW w:w="2495" w:type="dxa"/>
+            <w:tcW w:w="2494" w:type="dxa"/>
             <w:tcBorders>
               <w:top w:val="single" w:sz="4" w:space="0" w:color="AAAAAA"/>
               <w:left w:val="single" w:sz="4" w:space="0" w:color="AAAAAA"/>
@@ -3682,7 +3674,7 @@
         </w:tc>
         <w:tc>
           <w:tcPr>
-            <w:tcW w:w="1705" w:type="dxa"/>
+            <w:tcW w:w="1706" w:type="dxa"/>
             <w:tcBorders>
               <w:top w:val="single" w:sz="4" w:space="0" w:color="AAAAAA"/>
               <w:left w:val="single" w:sz="4" w:space="0" w:color="DDDDDD"/>
@@ -3713,7 +3705,7 @@
         </w:tc>
         <w:tc>
           <w:tcPr>
-            <w:tcW w:w="2099" w:type="dxa"/>
+            <w:tcW w:w="2098" w:type="dxa"/>
             <w:tcBorders>
               <w:top w:val="single" w:sz="4" w:space="0" w:color="AAAAAA"/>
               <w:left w:val="single" w:sz="4" w:space="0" w:color="DDDDDD"/>
@@ -3744,7 +3736,7 @@
         </w:tc>
         <w:tc>
           <w:tcPr>
-            <w:tcW w:w="2101" w:type="dxa"/>
+            <w:tcW w:w="2102" w:type="dxa"/>
             <w:tcBorders>
               <w:top w:val="single" w:sz="4" w:space="0" w:color="AAAAAA"/>
               <w:left w:val="single" w:sz="4" w:space="0" w:color="DDDDDD"/>
@@ -3809,7 +3801,7 @@
         <w:trPr/>
         <w:tc>
           <w:tcPr>
-            <w:tcW w:w="2495" w:type="dxa"/>
+            <w:tcW w:w="2494" w:type="dxa"/>
             <w:tcBorders>
               <w:top w:val="single" w:sz="4" w:space="0" w:color="DDDDDD"/>
               <w:left w:val="single" w:sz="4" w:space="0" w:color="AAAAAA"/>
@@ -3838,7 +3830,7 @@
         </w:tc>
         <w:tc>
           <w:tcPr>
-            <w:tcW w:w="1705" w:type="dxa"/>
+            <w:tcW w:w="1706" w:type="dxa"/>
             <w:tcBorders>
               <w:top w:val="single" w:sz="4" w:space="0" w:color="DDDDDD"/>
               <w:left w:val="single" w:sz="4" w:space="0" w:color="DDDDDD"/>
@@ -3867,7 +3859,7 @@
         </w:tc>
         <w:tc>
           <w:tcPr>
-            <w:tcW w:w="2099" w:type="dxa"/>
+            <w:tcW w:w="2098" w:type="dxa"/>
             <w:tcBorders>
               <w:top w:val="single" w:sz="4" w:space="0" w:color="DDDDDD"/>
               <w:left w:val="single" w:sz="4" w:space="0" w:color="DDDDDD"/>
@@ -3896,7 +3888,7 @@
         </w:tc>
         <w:tc>
           <w:tcPr>
-            <w:tcW w:w="2101" w:type="dxa"/>
+            <w:tcW w:w="2102" w:type="dxa"/>
             <w:tcBorders>
               <w:top w:val="single" w:sz="4" w:space="0" w:color="DDDDDD"/>
               <w:left w:val="single" w:sz="4" w:space="0" w:color="DDDDDD"/>
@@ -3958,8 +3950,14 @@
       <w:pPr>
         <w:pStyle w:val="Normal"/>
         <w:spacing w:before="300" w:after="0"/>
-        <w:jc w:val="center"/>
-        <w:rPr>
+        <w:jc w:val="left"/>
+        <w:rPr>
+          <w:rFonts w:eastAsia="Iceland" w:cs="Iceland"/>
+          <w:i/>
+          <w:i/>
+          <w:iCs/>
+          <w:sz w:val="14"/>
+          <w:szCs w:val="14"/>
           <w:lang w:val="zxx" w:eastAsia="zxx" w:bidi="zxx"/>
         </w:rPr>
       </w:pPr>
@@ -3972,8 +3970,23 @@
           <w:szCs w:val="14"/>
           <w:lang w:val="zxx" w:eastAsia="zxx" w:bidi="zxx"/>
         </w:rPr>
-        <w:t xml:space="preserve">Document généré par l'outil de gestion du parc informatique </w:t>
       </w:r>
+    </w:p>
+    <w:p>
+      <w:pPr>
+        <w:pStyle w:val="Normal"/>
+        <w:spacing w:before="300" w:after="0"/>
+        <w:jc w:val="left"/>
+        <w:rPr>
+          <w:rFonts w:eastAsia="Iceland" w:cs="Iceland"/>
+          <w:i/>
+          <w:i/>
+          <w:iCs/>
+          <w:sz w:val="14"/>
+          <w:szCs w:val="14"/>
+          <w:lang w:val="zxx" w:eastAsia="zxx" w:bidi="zxx"/>
+        </w:rPr>
+      </w:pPr>
       <w:r>
         <w:rPr>
           <w:rFonts w:eastAsia="Iceland" w:cs="Iceland"/>
@@ -3983,7 +3996,274 @@
           <w:szCs w:val="14"/>
           <w:lang w:val="zxx" w:eastAsia="zxx" w:bidi="zxx"/>
         </w:rPr>
-        <w:t>(GPI - CG1)</w:t>
+      </w:r>
+    </w:p>
+    <w:p>
+      <w:pPr>
+        <w:pStyle w:val="Normal"/>
+        <w:spacing w:before="300" w:after="0"/>
+        <w:jc w:val="left"/>
+        <w:rPr>
+          <w:rFonts w:eastAsia="Iceland" w:cs="Iceland"/>
+          <w:i/>
+          <w:i/>
+          <w:iCs/>
+          <w:sz w:val="14"/>
+          <w:szCs w:val="14"/>
+          <w:lang w:val="zxx" w:eastAsia="zxx" w:bidi="zxx"/>
+        </w:rPr>
+      </w:pPr>
+      <w:r>
+        <w:rPr>
+          <w:rFonts w:eastAsia="Iceland" w:cs="Iceland"/>
+          <w:i/>
+          <w:iCs/>
+          <w:sz w:val="14"/>
+          <w:szCs w:val="14"/>
+          <w:lang w:val="zxx" w:eastAsia="zxx" w:bidi="zxx"/>
+        </w:rPr>
+        <w:t xml:space="preserve">Le </w:t>
+      </w:r>
+    </w:p>
+    <w:p>
+      <w:pPr>
+        <w:pStyle w:val="Normal"/>
+        <w:spacing w:before="300" w:after="0"/>
+        <w:jc w:val="center"/>
+        <w:rPr>
+          <w:lang w:val="zxx" w:eastAsia="zxx" w:bidi="zxx"/>
+        </w:rPr>
+      </w:pPr>
+      <w:r>
+        <w:rPr>
+          <w:rFonts w:eastAsia="Iceland" w:cs="Iceland"/>
+          <w:i/>
+          <w:iCs/>
+          <w:sz w:val="14"/>
+          <w:szCs w:val="14"/>
+          <w:lang w:val="zxx" w:eastAsia="zxx" w:bidi="zxx"/>
+        </w:rPr>
+      </w:r>
+    </w:p>
+    <w:p>
+      <w:pPr>
+        <w:pStyle w:val="Normal"/>
+        <w:spacing w:before="300" w:after="0"/>
+        <w:jc w:val="center"/>
+        <w:rPr>
+          <w:lang w:val="zxx" w:eastAsia="zxx" w:bidi="zxx"/>
+        </w:rPr>
+      </w:pPr>
+      <w:r>
+        <w:rPr>
+          <w:rFonts w:eastAsia="Iceland" w:cs="Iceland"/>
+          <w:i/>
+          <w:iCs/>
+          <w:sz w:val="14"/>
+          <w:szCs w:val="14"/>
+          <w:lang w:val="zxx" w:eastAsia="zxx" w:bidi="zxx"/>
+        </w:rPr>
+      </w:r>
+    </w:p>
+    <w:p>
+      <w:pPr>
+        <w:pStyle w:val="Normal"/>
+        <w:spacing w:before="300" w:after="0"/>
+        <w:jc w:val="center"/>
+        <w:rPr>
+          <w:lang w:val="zxx" w:eastAsia="zxx" w:bidi="zxx"/>
+        </w:rPr>
+      </w:pPr>
+      <w:r>
+        <w:rPr>
+          <w:rFonts w:eastAsia="Iceland" w:cs="Iceland"/>
+          <w:i/>
+          <w:iCs/>
+          <w:sz w:val="14"/>
+          <w:szCs w:val="14"/>
+          <w:lang w:val="zxx" w:eastAsia="zxx" w:bidi="zxx"/>
+        </w:rPr>
+      </w:r>
+    </w:p>
+    <w:p>
+      <w:pPr>
+        <w:pStyle w:val="Normal"/>
+        <w:spacing w:before="300" w:after="0"/>
+        <w:jc w:val="center"/>
+        <w:rPr>
+          <w:lang w:val="zxx" w:eastAsia="zxx" w:bidi="zxx"/>
+        </w:rPr>
+      </w:pPr>
+      <w:r>
+        <w:rPr>
+          <w:rFonts w:eastAsia="Iceland" w:cs="Iceland"/>
+          <w:i/>
+          <w:iCs/>
+          <w:sz w:val="14"/>
+          <w:szCs w:val="14"/>
+          <w:lang w:val="zxx" w:eastAsia="zxx" w:bidi="zxx"/>
+        </w:rPr>
+      </w:r>
+    </w:p>
+    <w:p>
+      <w:pPr>
+        <w:pStyle w:val="Normal"/>
+        <w:spacing w:before="300" w:after="0"/>
+        <w:jc w:val="center"/>
+        <w:rPr>
+          <w:lang w:val="zxx" w:eastAsia="zxx" w:bidi="zxx"/>
+        </w:rPr>
+      </w:pPr>
+      <w:r>
+        <w:rPr>
+          <w:rFonts w:eastAsia="Iceland" w:cs="Iceland"/>
+          <w:i/>
+          <w:iCs/>
+          <w:sz w:val="14"/>
+          <w:szCs w:val="14"/>
+          <w:lang w:val="zxx" w:eastAsia="zxx" w:bidi="zxx"/>
+        </w:rPr>
+      </w:r>
+    </w:p>
+    <w:p>
+      <w:pPr>
+        <w:pStyle w:val="Normal"/>
+        <w:spacing w:before="300" w:after="0"/>
+        <w:jc w:val="center"/>
+        <w:rPr>
+          <w:lang w:val="zxx" w:eastAsia="zxx" w:bidi="zxx"/>
+        </w:rPr>
+      </w:pPr>
+      <w:r>
+        <w:rPr>
+          <w:rFonts w:eastAsia="Iceland" w:cs="Iceland"/>
+          <w:i/>
+          <w:iCs/>
+          <w:sz w:val="14"/>
+          <w:szCs w:val="14"/>
+          <w:lang w:val="zxx" w:eastAsia="zxx" w:bidi="zxx"/>
+        </w:rPr>
+      </w:r>
+    </w:p>
+    <w:p>
+      <w:pPr>
+        <w:pStyle w:val="Normal"/>
+        <w:spacing w:before="300" w:after="0"/>
+        <w:jc w:val="center"/>
+        <w:rPr>
+          <w:lang w:val="zxx" w:eastAsia="zxx" w:bidi="zxx"/>
+        </w:rPr>
+      </w:pPr>
+      <w:r>
+        <w:rPr>
+          <w:rFonts w:eastAsia="Iceland" w:cs="Iceland"/>
+          <w:i/>
+          <w:iCs/>
+          <w:sz w:val="14"/>
+          <w:szCs w:val="14"/>
+          <w:lang w:val="zxx" w:eastAsia="zxx" w:bidi="zxx"/>
+        </w:rPr>
+      </w:r>
+    </w:p>
+    <w:p>
+      <w:pPr>
+        <w:pStyle w:val="Normal"/>
+        <w:spacing w:before="300" w:after="0"/>
+        <w:jc w:val="center"/>
+        <w:rPr>
+          <w:lang w:val="zxx" w:eastAsia="zxx" w:bidi="zxx"/>
+        </w:rPr>
+      </w:pPr>
+      <w:r>
+        <w:rPr>
+          <w:rFonts w:eastAsia="Iceland" w:cs="Iceland"/>
+          <w:i/>
+          <w:iCs/>
+          <w:sz w:val="14"/>
+          <w:szCs w:val="14"/>
+          <w:lang w:val="zxx" w:eastAsia="zxx" w:bidi="zxx"/>
+        </w:rPr>
+      </w:r>
+    </w:p>
+    <w:p>
+      <w:pPr>
+        <w:pStyle w:val="Normal"/>
+        <w:spacing w:before="300" w:after="0"/>
+        <w:jc w:val="center"/>
+        <w:rPr>
+          <w:lang w:val="zxx" w:eastAsia="zxx" w:bidi="zxx"/>
+        </w:rPr>
+      </w:pPr>
+      <w:r>
+        <w:rPr>
+          <w:rFonts w:eastAsia="Iceland" w:cs="Iceland"/>
+          <w:i/>
+          <w:iCs/>
+          <w:sz w:val="14"/>
+          <w:szCs w:val="14"/>
+          <w:lang w:val="zxx" w:eastAsia="zxx" w:bidi="zxx"/>
+        </w:rPr>
+      </w:r>
+    </w:p>
+    <w:p>
+      <w:pPr>
+        <w:pStyle w:val="Normal"/>
+        <w:spacing w:before="300" w:after="0"/>
+        <w:jc w:val="center"/>
+        <w:rPr>
+          <w:lang w:val="zxx" w:eastAsia="zxx" w:bidi="zxx"/>
+        </w:rPr>
+      </w:pPr>
+      <w:r>
+        <w:rPr>
+          <w:rFonts w:eastAsia="Iceland" w:cs="Iceland"/>
+          <w:i/>
+          <w:iCs/>
+          <w:sz w:val="14"/>
+          <w:szCs w:val="14"/>
+          <w:lang w:val="zxx" w:eastAsia="zxx" w:bidi="zxx"/>
+        </w:rPr>
+      </w:r>
+    </w:p>
+    <w:p>
+      <w:pPr>
+        <w:pStyle w:val="Normal"/>
+        <w:spacing w:before="300" w:after="0"/>
+        <w:jc w:val="center"/>
+        <w:rPr>
+          <w:lang w:val="zxx" w:eastAsia="zxx" w:bidi="zxx"/>
+        </w:rPr>
+      </w:pPr>
+      <w:r>
+        <w:rPr>
+          <w:rFonts w:eastAsia="Iceland" w:cs="Iceland"/>
+          <w:i/>
+          <w:iCs/>
+          <w:sz w:val="14"/>
+          <w:szCs w:val="14"/>
+          <w:lang w:val="zxx" w:eastAsia="zxx" w:bidi="zxx"/>
+        </w:rPr>
+      </w:r>
+    </w:p>
+    <w:p>
+      <w:pPr>
+        <w:pStyle w:val="Normal"/>
+        <w:spacing w:before="300" w:after="0"/>
+        <w:jc w:val="center"/>
+        <w:rPr>
+          <w:lang w:val="zxx" w:eastAsia="zxx" w:bidi="zxx"/>
+        </w:rPr>
+      </w:pPr>
+      <w:r>
+        <w:rPr>
+          <w:rFonts w:eastAsia="Iceland" w:cs="Iceland"/>
+          <w:i/>
+          <w:iCs/>
+          <w:sz w:val="14"/>
+          <w:szCs w:val="14"/>
+          <w:lang w:val="zxx" w:eastAsia="zxx" w:bidi="zxx"/>
+        </w:rPr>
+        <w:t>Document généré par l'outil de gestion du parc informatique (GPI - CG1)</w:t>
       </w:r>
     </w:p>
     <w:sectPr>
@@ -3996,7 +4276,7 @@
       <w:pgNumType w:fmt="decimal"/>
       <w:formProt w:val="false"/>
       <w:textDirection w:val="lrTb"/>
-      <w:docGrid w:type="default" w:linePitch="360" w:charSpace="14335"/>
+      <w:docGrid w:type="default" w:linePitch="360" w:charSpace="14130"/>
     </w:sectPr>
   </w:body>
 </w:document>
@@ -4091,31 +4371,7 @@
         <w:szCs w:val="16"/>
         <w:u w:val="single"/>
       </w:rPr>
-      <w:t>commulego</w:t>
-    </w:r>
-    <w:r>
-      <w:rPr>
-        <w:rFonts w:eastAsia="Iceland" w:cs="Iceland" w:ascii="FreeSerif" w:hAnsi="FreeSerif"/>
-        <w:b/>
-        <w:bCs/>
-        <w:color w:val="2A6099"/>
-        <w:sz w:val="16"/>
-        <w:szCs w:val="16"/>
-        <w:u w:val="single"/>
-      </w:rPr>
-      <w:t>l</w:t>
-    </w:r>
-    <w:r>
-      <w:rPr>
-        <w:rFonts w:eastAsia="Iceland" w:cs="Iceland" w:ascii="FreeSerif" w:hAnsi="FreeSerif"/>
-        <w:b/>
-        <w:bCs/>
-        <w:color w:val="2A6099"/>
-        <w:sz w:val="16"/>
-        <w:szCs w:val="16"/>
-        <w:u w:val="single"/>
-      </w:rPr>
-      <w:t>fe1togo@gmail.com</w:t>
+      <w:t>commulegolfe1togo@gmail.com</w:t>
     </w:r>
   </w:p>
 </w:ftr>
@@ -4196,31 +4452,7 @@
         <w:szCs w:val="16"/>
         <w:u w:val="single"/>
       </w:rPr>
-      <w:t>commulego</w:t>
-    </w:r>
-    <w:r>
-      <w:rPr>
-        <w:rFonts w:eastAsia="Iceland" w:cs="Iceland" w:ascii="FreeSerif" w:hAnsi="FreeSerif"/>
-        <w:b/>
-        <w:bCs/>
-        <w:color w:val="2A6099"/>
-        <w:sz w:val="16"/>
-        <w:szCs w:val="16"/>
-        <w:u w:val="single"/>
-      </w:rPr>
-      <w:t>l</w:t>
-    </w:r>
-    <w:r>
-      <w:rPr>
-        <w:rFonts w:eastAsia="Iceland" w:cs="Iceland" w:ascii="FreeSerif" w:hAnsi="FreeSerif"/>
-        <w:b/>
-        <w:bCs/>
-        <w:color w:val="2A6099"/>
-        <w:sz w:val="16"/>
-        <w:szCs w:val="16"/>
-        <w:u w:val="single"/>
-      </w:rPr>
-      <w:t>fe1togo@gmail.com</w:t>
+      <w:t>commulegolfe1togo@gmail.com</w:t>
     </w:r>
   </w:p>
 </w:ftr>
@@ -4248,6 +4480,7 @@
     <w:qFormat/>
     <w:pPr>
       <w:widowControl/>
+      <w:suppressAutoHyphens w:val="true"/>
       <w:bidi w:val="0"/>
       <w:spacing w:before="0" w:after="0"/>
       <w:jc w:val="left"/>
@@ -4263,7 +4496,7 @@
   </w:style>
   <w:style w:type="paragraph" w:styleId="Heading1">
     <w:name w:val="heading 1"/>
-    <w:basedOn w:val="Titre"/>
+    <w:basedOn w:val="Titreuser"/>
     <w:qFormat/>
     <w:pPr/>
     <w:rPr>
@@ -4274,7 +4507,7 @@
   </w:style>
   <w:style w:type="paragraph" w:styleId="Heading2">
     <w:name w:val="heading 2"/>
-    <w:basedOn w:val="Titre"/>
+    <w:basedOn w:val="Titreuser"/>
     <w:qFormat/>
     <w:pPr/>
     <w:rPr>
@@ -4285,7 +4518,7 @@
   </w:style>
   <w:style w:type="paragraph" w:styleId="Heading3">
     <w:name w:val="heading 3"/>
-    <w:basedOn w:val="Titre"/>
+    <w:basedOn w:val="Titreuser"/>
     <w:qFormat/>
     <w:pPr/>
     <w:rPr>
@@ -4296,7 +4529,7 @@
   </w:style>
   <w:style w:type="paragraph" w:styleId="Heading4">
     <w:name w:val="heading 4"/>
-    <w:basedOn w:val="Titre"/>
+    <w:basedOn w:val="Titreuser"/>
     <w:qFormat/>
     <w:pPr/>
     <w:rPr>
@@ -4307,7 +4540,7 @@
   </w:style>
   <w:style w:type="paragraph" w:styleId="Heading5">
     <w:name w:val="heading 5"/>
-    <w:basedOn w:val="Titre"/>
+    <w:basedOn w:val="Titreuser"/>
     <w:qFormat/>
     <w:pPr/>
     <w:rPr>
@@ -4316,7 +4549,7 @@
   </w:style>
   <w:style w:type="paragraph" w:styleId="Heading6">
     <w:name w:val="heading 6"/>
-    <w:basedOn w:val="Titre"/>
+    <w:basedOn w:val="Titreuser"/>
     <w:qFormat/>
     <w:pPr/>
     <w:rPr>
@@ -4332,11 +4565,18 @@
       <w:u w:val="single"/>
     </w:rPr>
   </w:style>
-  <w:style w:type="character" w:styleId="Caractresdenotedebasdepage">
-    <w:name w:val="Caractères de note de bas de page"/>
+  <w:style w:type="character" w:styleId="Caractresdenotedebasdepageuser">
+    <w:name w:val="Caractères de note de bas de page (user)"/>
     <w:uiPriority w:val="99"/>
     <w:semiHidden/>
     <w:unhideWhenUsed/>
+    <w:qFormat/>
+    <w:rPr>
+      <w:vertAlign w:val="superscript"/>
+    </w:rPr>
+  </w:style>
+  <w:style w:type="character" w:styleId="Caractresdenotedebasdepage">
+    <w:name w:val="Caractères de note de bas de page"/>
     <w:qFormat/>
     <w:rPr>
       <w:vertAlign w:val="superscript"/>
@@ -4359,11 +4599,18 @@
       <w:szCs w:val="20"/>
     </w:rPr>
   </w:style>
-  <w:style w:type="character" w:styleId="Caractresdenotedefin">
-    <w:name w:val="Caractères de note de fin"/>
+  <w:style w:type="character" w:styleId="Caractresdenotedefinuser">
+    <w:name w:val="Caractères de note de fin (user)"/>
     <w:uiPriority w:val="99"/>
     <w:semiHidden/>
     <w:unhideWhenUsed/>
+    <w:qFormat/>
+    <w:rPr>
+      <w:vertAlign w:val="superscript"/>
+    </w:rPr>
+  </w:style>
+  <w:style w:type="character" w:styleId="Caractresdenotedefin">
+    <w:name w:val="Caractères de note de fin"/>
     <w:qFormat/>
     <w:rPr>
       <w:vertAlign w:val="superscript"/>
@@ -4444,9 +4691,24 @@
       <w:rFonts w:cs="FreeSans"/>
     </w:rPr>
   </w:style>
+  <w:style w:type="paragraph" w:styleId="Titreuser">
+    <w:name w:val="Titre (user)"/>
+    <w:basedOn w:val="Normal"/>
+    <w:next w:val="BodyText"/>
+    <w:qFormat/>
+    <w:pPr>
+      <w:keepNext w:val="true"/>
+      <w:spacing w:before="240" w:after="120"/>
+    </w:pPr>
+    <w:rPr>
+      <w:rFonts w:ascii="Liberation Sans" w:hAnsi="Liberation Sans" w:eastAsia="WenQuanYi Zen Hei" w:cs="FreeSans"/>
+      <w:sz w:val="28"/>
+      <w:szCs w:val="28"/>
+    </w:rPr>
+  </w:style>
   <w:style w:type="paragraph" w:styleId="Title">
     <w:name w:val="Title"/>
-    <w:basedOn w:val="Titre"/>
+    <w:basedOn w:val="Titreuser"/>
     <w:qFormat/>
     <w:pPr/>
     <w:rPr>
@@ -4459,6 +4721,7 @@
     <w:qFormat/>
     <w:pPr>
       <w:widowControl/>
+      <w:suppressAutoHyphens w:val="true"/>
       <w:bidi w:val="0"/>
       <w:spacing w:before="0" w:after="0"/>
       <w:jc w:val="left"/>
@@ -4479,6 +4742,7 @@
     <w:qFormat/>
     <w:pPr>
       <w:widowControl/>
+      <w:suppressAutoHyphens w:val="true"/>
       <w:bidi w:val="0"/>
       <w:spacing w:before="0" w:after="0"/>
       <w:jc w:val="left"/>
@@ -4522,6 +4786,13 @@
       <w:szCs w:val="20"/>
     </w:rPr>
   </w:style>
+  <w:style w:type="paragraph" w:styleId="En-tteetpieddepageuser">
+    <w:name w:val="En-tête et pied de page (user)"/>
+    <w:basedOn w:val="Normal"/>
+    <w:qFormat/>
+    <w:pPr/>
+    <w:rPr/>
+  </w:style>
   <w:style w:type="paragraph" w:styleId="En-tteetpieddepage">
     <w:name w:val="En-tête et pied de page"/>
     <w:basedOn w:val="Normal"/>
@@ -4531,12 +4802,12 @@
   </w:style>
   <w:style w:type="paragraph" w:styleId="Footer">
     <w:name w:val="footer"/>
-    <w:basedOn w:val="En-tteetpieddepage"/>
+    <w:basedOn w:val="En-tteetpieddepageuser"/>
     <w:pPr/>
     <w:rPr/>
   </w:style>
-  <w:style w:type="paragraph" w:styleId="Contenudetableau">
-    <w:name w:val="Contenu de tableau"/>
+  <w:style w:type="paragraph" w:styleId="Contenudetableauuser">
+    <w:name w:val="Contenu de tableau (user)"/>
     <w:basedOn w:val="Normal"/>
     <w:qFormat/>
     <w:pPr>
@@ -4545,9 +4816,9 @@
     </w:pPr>
     <w:rPr/>
   </w:style>
-  <w:style w:type="paragraph" w:styleId="Titredetableau">
-    <w:name w:val="Titre de tableau"/>
-    <w:basedOn w:val="Contenudetableau"/>
+  <w:style w:type="paragraph" w:styleId="Titredetableauuser">
+    <w:name w:val="Titre de tableau (user)"/>
+    <w:basedOn w:val="Contenudetableauuser"/>
     <w:qFormat/>
     <w:pPr>
       <w:suppressLineNumbers/>

</xml_diff>